<commit_message>
court(sc coa): amicus-brief gated on every engine (footnote clearance 12.5, measured: 11 to 14 agree; the note after a section token kept in LaTeX, lane 2), conclusion kept with the signature block (fb-595.54.67)
Co-Authored-By: Claude Opus 5.5 <noreply@anthropic.com>
</commit_message>
<xml_diff>
--- a/courts/fourth-circuit/south-carolina/state/court-of-appeals/amicus-brief/usage/OUTPUT-amicus-brief.docx
+++ b/courts/fourth-circuit/south-carolina/state/court-of-appeals/amicus-brief/usage/OUTPUT-amicus-brief.docx
@@ -2676,7 +2676,7 @@
         <w:tab/>
       </w:r>
       <w:r>
-        <w:t xml:space="preserve">19</w:t>
+        <w:t xml:space="preserve">20</w:t>
       </w:r>
     </w:p>
     <w:p>
@@ -14899,7 +14899,7 @@
     </w:p>
     <w:p>
       <w:pPr>
-        <w:pStyle w:val="BodyText"/>
+        <w:pStyle w:val="BodyTextKeep"/>
       </w:pPr>
       <w:r>
         <w:t xml:space="preserve">Dismissal of Appellant’s case was incorrect as a matter of statutory interpretation, unconstitutional under both the state and federal constitutions, and fundamentally unfair. And if the circuit court’s reasoning is upheld, Appellant’s case is only a harbinger of things to come. The ACLU of South Carolina urges this Court to reject the circuit court’s interpretation.</w:t>
@@ -14907,6 +14907,8 @@
     </w:p>
     <w:p>
       <w:pPr>
+        <w:keepNext/>
+        <w:keepLines/>
         <w:spacing w:before="0" w:after="0" w:line="576" w:lineRule="exact"/>
       </w:pPr>
     </w:p>
@@ -16412,6 +16414,15 @@
       <w:ind w:firstLine="0"/>
     </w:pPr>
   </w:style>
+  <w:style w:type="paragraph" w:customStyle="1" w:styleId="BodyTextKeep">
+    <w:name w:val="Body Text Keep"/>
+    <w:basedOn w:val="BodyText"/>
+    <w:qFormat/>
+    <w:pPr>
+      <w:keepNext/>
+      <w:keepLines/>
+    </w:pPr>
+  </w:style>
   <w:style w:type="paragraph" w:customStyle="1" w:styleId="XdList1">
     <w:name w:val="XdList 1"/>
     <w:basedOn w:val="Normal"/>

</xml_diff>